<commit_message>
update ATS friendly Resume additional
</commit_message>
<xml_diff>
--- a/v2/src/assets/resume/Mark_Valles_Resume.docx
+++ b/v2/src/assets/resume/Mark_Valles_Resume.docx
@@ -1497,9 +1497,6 @@
         <w:tc>
           <w:tcPr>
             <w:tcW w:w="3312" w:type="dxa"/>
-            <w:tcBorders>
-              <w:bottom w:val="single" w:sz="4" w:space="0" w:color="F1F5F9"/>
-            </w:tcBorders>
             <w:tcMar>
               <w:top w:w="60" w:type="dxa"/>
               <w:left w:w="40" w:type="dxa"/>
@@ -1524,9 +1521,6 @@
         <w:tc>
           <w:tcPr>
             <w:tcW w:w="6725" w:type="dxa"/>
-            <w:tcBorders>
-              <w:bottom w:val="single" w:sz="4" w:space="0" w:color="F1F5F9"/>
-            </w:tcBorders>
             <w:tcMar>
               <w:top w:w="60" w:type="dxa"/>
               <w:left w:w="40" w:type="dxa"/>
@@ -1543,6 +1537,72 @@
                 <w:sz w:val="19"/>
               </w:rPr>
               <w:t>Test Driven Development (TDD), Selenium Test Automation, Remix Smart Contract Deployment, Network &amp; Hardware Provisioning</w:t>
+            </w:r>
+          </w:p>
+        </w:tc>
+      </w:tr>
+      <w:tr>
+        <w:trPr>
+          <w:jc w:val="center"/>
+        </w:trPr>
+        <w:tc>
+          <w:tcPr>
+            <w:tcW w:w="3312" w:type="dxa"/>
+            <w:tcBorders>
+              <w:bottom w:val="single" w:sz="4" w:space="0" w:color="F1F5F9"/>
+            </w:tcBorders>
+            <w:tcMar>
+              <w:top w:w="60" w:type="dxa"/>
+              <w:left w:w="40" w:type="dxa"/>
+              <w:bottom w:w="60" w:type="dxa"/>
+              <w:right w:w="40" w:type="dxa"/>
+            </w:tcMar>
+          </w:tcPr>
+          <w:p>
+            <w:pPr>
+              <w:spacing w:after="0"/>
+              <w:rPr>
+                <w:b/>
+                <w:color w:val="0F172A"/>
+                <w:sz w:val="17"/>
+              </w:rPr>
+            </w:pPr>
+            <w:r>
+              <w:rPr>
+                <w:b/>
+                <w:bCs/>
+                <w:color w:val="0F172A"/>
+                <w:sz w:val="17"/>
+              </w:rPr>
+              <w:t>Methodologies &amp; SDLC</w:t>
+            </w:r>
+          </w:p>
+        </w:tc>
+        <w:tc>
+          <w:tcPr>
+            <w:tcW w:w="6725" w:type="dxa"/>
+            <w:tcBorders>
+              <w:bottom w:val="single" w:sz="4" w:space="0" w:color="F1F5F9"/>
+            </w:tcBorders>
+            <w:tcMar>
+              <w:top w:w="60" w:type="dxa"/>
+              <w:left w:w="40" w:type="dxa"/>
+              <w:bottom w:w="60" w:type="dxa"/>
+              <w:right w:w="40" w:type="dxa"/>
+            </w:tcMar>
+          </w:tcPr>
+          <w:p>
+            <w:pPr>
+              <w:spacing w:after="0"/>
+              <w:rPr>
+                <w:sz w:val="19"/>
+              </w:rPr>
+            </w:pPr>
+            <w:r>
+              <w:rPr>
+                <w:sz w:val="19"/>
+              </w:rPr>
+              <w:t>Agile Scrum, Waterfall, Full SDLC Lifecycle</w:t>
             </w:r>
           </w:p>
         </w:tc>
@@ -1574,7 +1634,49 @@
           <w:color w:val="475569"/>
           <w:sz w:val="19"/>
         </w:rPr>
-        <w:t>System Architecture Development  •  Music Composition &amp; Writing  •  Motorcycle Riding  •  Guitar Engineering &amp; Upgrades</w:t>
+        <w:t xml:space="preserve">System Architecture </w:t>
+      </w:r>
+      <w:r>
+        <w:rPr>
+          <w:color w:val="475569"/>
+          <w:sz w:val="19"/>
+        </w:rPr>
+        <w:t>Development • Music</w:t>
+      </w:r>
+      <w:r>
+        <w:rPr>
+          <w:color w:val="475569"/>
+          <w:sz w:val="19"/>
+        </w:rPr>
+        <w:t xml:space="preserve"> Composition &amp; </w:t>
+      </w:r>
+      <w:r>
+        <w:rPr>
+          <w:color w:val="475569"/>
+          <w:sz w:val="19"/>
+        </w:rPr>
+        <w:t>Writing • Motorcycle</w:t>
+      </w:r>
+      <w:r>
+        <w:rPr>
+          <w:color w:val="475569"/>
+          <w:sz w:val="19"/>
+        </w:rPr>
+        <w:t xml:space="preserve"> </w:t>
+      </w:r>
+      <w:r>
+        <w:rPr>
+          <w:color w:val="475569"/>
+          <w:sz w:val="19"/>
+        </w:rPr>
+        <w:t>Riding • Guitar</w:t>
+      </w:r>
+      <w:r>
+        <w:rPr>
+          <w:color w:val="475569"/>
+          <w:sz w:val="19"/>
+        </w:rPr>
+        <w:t xml:space="preserve"> Engineering &amp; Upgrades</w:t>
       </w:r>
     </w:p>
     <w:sectPr>
@@ -2446,7 +2548,6 @@
   <w:style w:type="character" w:default="1" w:styleId="DefaultParagraphFont">
     <w:name w:val="Default Paragraph Font"/>
     <w:uiPriority w:val="1"/>
-    <w:semiHidden/>
     <w:unhideWhenUsed/>
   </w:style>
   <w:style w:type="table" w:default="1" w:styleId="TableNormal">

</xml_diff>

<commit_message>
update resume add professional summary
</commit_message>
<xml_diff>
--- a/v2/src/assets/resume/Mark_Valles_Resume.docx
+++ b/v2/src/assets/resume/Mark_Valles_Resume.docx
@@ -27,7 +27,15 @@
           <w:color w:val="475569"/>
           <w:sz w:val="22"/>
         </w:rPr>
-        <w:t>Fullstack Engineer &amp; Web Developer</w:t>
+        <w:t xml:space="preserve">Fullstack Engineer &amp; </w:t>
+      </w:r>
+      <w:r>
+        <w:rPr>
+          <w:b/>
+          <w:color w:val="475569"/>
+          <w:sz w:val="22"/>
+        </w:rPr>
+        <w:t>System Analyst</w:t>
       </w:r>
     </w:p>
     <w:p>
@@ -94,6 +102,61 @@
     </w:p>
     <w:p>
       <w:pPr>
+        <w:pBdr>
+          <w:bottom w:val="single" w:sz="12" w:space="4" w:color="0F172A"/>
+        </w:pBdr>
+        <w:spacing w:before="320" w:after="120"/>
+        <w:rPr>
+          <w:b/>
+          <w:bCs/>
+          <w:sz w:val="19"/>
+          <w:lang w:val="en-PH"/>
+        </w:rPr>
+      </w:pPr>
+      <w:r>
+        <w:rPr>
+          <w:b/>
+          <w:color w:val="0F172A"/>
+          <w:sz w:val="22"/>
+        </w:rPr>
+        <w:t>P</w:t>
+      </w:r>
+      <w:r>
+        <w:rPr>
+          <w:b/>
+          <w:color w:val="0F172A"/>
+          <w:sz w:val="22"/>
+        </w:rPr>
+        <w:t>ROFESSIONAL SUMMARY</w:t>
+      </w:r>
+      <w:r>
+        <w:br/>
+      </w:r>
+      <w:r>
+        <w:rPr>
+          <w:b/>
+          <w:bCs/>
+          <w:sz w:val="19"/>
+          <w:lang w:val="en-PH"/>
+        </w:rPr>
+        <w:t>Fullstack Engineer</w:t>
+      </w:r>
+      <w:r>
+        <w:rPr>
+          <w:sz w:val="19"/>
+          <w:lang w:val="en-PH"/>
+        </w:rPr>
+        <w:t xml:space="preserve"> </w:t>
+      </w:r>
+      <w:r>
+        <w:rPr>
+          <w:sz w:val="19"/>
+        </w:rPr>
+        <w:t>who maximizes system scalability and infrastructure reliability across the entire software lifecycle by engineering systems based on industry standards and leveraging foundational principles to debug manually, while effectively utilizing prompt engineering and model-efficient AI usage as an accelerator to drastically reduce delivery turnaround times.</w:t>
+      </w:r>
+    </w:p>
+    <w:p>
+      <w:pPr>
         <w:keepNext/>
         <w:pBdr>
           <w:bottom w:val="single" w:sz="12" w:space="4" w:color="0F172A"/>
@@ -151,7 +214,21 @@
                 <w:color w:val="64748B"/>
                 <w:sz w:val="19"/>
               </w:rPr>
-              <w:t xml:space="preserve"> | Ascendion Digital Solutions (Client: Security Bank Corporation)</w:t>
+              <w:t xml:space="preserve"> | Ascendion Digital Solutions </w:t>
+            </w:r>
+            <w:r>
+              <w:rPr>
+                <w:color w:val="64748B"/>
+                <w:sz w:val="19"/>
+              </w:rPr>
+              <w:br/>
+            </w:r>
+            <w:r>
+              <w:rPr>
+                <w:color w:val="64748B"/>
+                <w:sz w:val="19"/>
+              </w:rPr>
+              <w:t>(Client: Security Bank Corporation)</w:t>
             </w:r>
           </w:p>
         </w:tc>
@@ -191,7 +268,19 @@
         <w:rPr>
           <w:sz w:val="19"/>
         </w:rPr>
-        <w:t>Architecting, deploying, and maintaining foundational digital banking solutions for Security Bank Corporation. Collaborating closely across both responsive frontend interfaces and high-performance backend production architectures to ensure seamless high-availability banking services and optimized consumer user experiences.</w:t>
+        <w:t>Architecting, deploying, and maintaining foundational digital banking solutions for</w:t>
+      </w:r>
+      <w:r>
+        <w:rPr>
+          <w:sz w:val="19"/>
+        </w:rPr>
+        <w:t xml:space="preserve"> </w:t>
+      </w:r>
+      <w:r>
+        <w:rPr>
+          <w:sz w:val="19"/>
+        </w:rPr>
+        <w:t>Security Bank Corporation. Collaborating closely across both responsive frontend interfaces and high-performance backend production architectures to ensure seamless high-availability banking services and optimized consumer user experiences.</w:t>
       </w:r>
     </w:p>
     <w:tbl>
@@ -361,7 +450,7 @@
         <w:rPr>
           <w:sz w:val="19"/>
         </w:rPr>
-        <w:t>Maintained and refactored an enterprise legacy financial invoicing system built in native PHP, systematically optimizing transaction processing pipelines while ensuring complete code integrity and comprehensive runtime error resolution.</w:t>
+        <w:t>Maintained and refactored an enterprise legacy financial invoicing system, systematically optimizing transaction processing pipelines while ensuring complete code integrity and comprehensive runtime error resolution.</w:t>
       </w:r>
     </w:p>
     <w:tbl>
@@ -781,6 +870,9 @@
       <w:pPr>
         <w:spacing w:after="120"/>
         <w:jc w:val="both"/>
+        <w:rPr>
+          <w:sz w:val="19"/>
+        </w:rPr>
       </w:pPr>
       <w:r>
         <w:rPr>
@@ -788,6 +880,12 @@
         </w:rPr>
         <w:t>Provided advanced technical account triage, client issue resolution, and critical client relationship care for comprehensive healthcare-related consumer and corporate partner inquiries.</w:t>
       </w:r>
+    </w:p>
+    <w:p>
+      <w:pPr>
+        <w:spacing w:after="120"/>
+        <w:jc w:val="both"/>
+      </w:pPr>
     </w:p>
     <w:tbl>
       <w:tblPr>
@@ -824,6 +922,7 @@
                 <w:color w:val="1E293B"/>
                 <w:sz w:val="21"/>
               </w:rPr>
+              <w:lastRenderedPageBreak/>
               <w:t>Outsourced Developer</w:t>
             </w:r>
             <w:r>
@@ -918,7 +1017,6 @@
                 <w:color w:val="1E293B"/>
                 <w:sz w:val="21"/>
               </w:rPr>
-              <w:lastRenderedPageBreak/>
               <w:t>Software Developer &amp; Support</w:t>
             </w:r>
             <w:r>
@@ -1313,15 +1411,7 @@
                 <w:color w:val="1E293B"/>
                 <w:sz w:val="21"/>
               </w:rPr>
-              <w:t>Primary</w:t>
-            </w:r>
-            <w:r>
-              <w:rPr>
-                <w:b/>
-                <w:color w:val="1E293B"/>
-                <w:sz w:val="21"/>
-              </w:rPr>
-              <w:t xml:space="preserve"> </w:t>
+              <w:t xml:space="preserve">Primary </w:t>
             </w:r>
             <w:r>
               <w:rPr>
@@ -2133,6 +2223,304 @@
       </w:rPr>
     </w:lvl>
   </w:abstractNum>
+  <w:abstractNum w:abstractNumId="9" w15:restartNumberingAfterBreak="0">
+    <w:nsid w:val="0462484D"/>
+    <w:multiLevelType w:val="multilevel"/>
+    <w:tmpl w:val="D7D6B0A8"/>
+    <w:lvl w:ilvl="0">
+      <w:start w:val="1"/>
+      <w:numFmt w:val="bullet"/>
+      <w:lvlText w:val=""/>
+      <w:lvlJc w:val="left"/>
+      <w:pPr>
+        <w:tabs>
+          <w:tab w:val="num" w:pos="720"/>
+        </w:tabs>
+        <w:ind w:left="720" w:hanging="360"/>
+      </w:pPr>
+      <w:rPr>
+        <w:rFonts w:ascii="Symbol" w:hAnsi="Symbol" w:hint="default"/>
+        <w:sz w:val="20"/>
+      </w:rPr>
+    </w:lvl>
+    <w:lvl w:ilvl="1" w:tentative="1">
+      <w:start w:val="1"/>
+      <w:numFmt w:val="bullet"/>
+      <w:lvlText w:val="o"/>
+      <w:lvlJc w:val="left"/>
+      <w:pPr>
+        <w:tabs>
+          <w:tab w:val="num" w:pos="1440"/>
+        </w:tabs>
+        <w:ind w:left="1440" w:hanging="360"/>
+      </w:pPr>
+      <w:rPr>
+        <w:rFonts w:ascii="Courier New" w:hAnsi="Courier New" w:hint="default"/>
+        <w:sz w:val="20"/>
+      </w:rPr>
+    </w:lvl>
+    <w:lvl w:ilvl="2" w:tentative="1">
+      <w:start w:val="1"/>
+      <w:numFmt w:val="bullet"/>
+      <w:lvlText w:val=""/>
+      <w:lvlJc w:val="left"/>
+      <w:pPr>
+        <w:tabs>
+          <w:tab w:val="num" w:pos="2160"/>
+        </w:tabs>
+        <w:ind w:left="2160" w:hanging="360"/>
+      </w:pPr>
+      <w:rPr>
+        <w:rFonts w:ascii="Wingdings" w:hAnsi="Wingdings" w:hint="default"/>
+        <w:sz w:val="20"/>
+      </w:rPr>
+    </w:lvl>
+    <w:lvl w:ilvl="3" w:tentative="1">
+      <w:start w:val="1"/>
+      <w:numFmt w:val="bullet"/>
+      <w:lvlText w:val=""/>
+      <w:lvlJc w:val="left"/>
+      <w:pPr>
+        <w:tabs>
+          <w:tab w:val="num" w:pos="2880"/>
+        </w:tabs>
+        <w:ind w:left="2880" w:hanging="360"/>
+      </w:pPr>
+      <w:rPr>
+        <w:rFonts w:ascii="Wingdings" w:hAnsi="Wingdings" w:hint="default"/>
+        <w:sz w:val="20"/>
+      </w:rPr>
+    </w:lvl>
+    <w:lvl w:ilvl="4" w:tentative="1">
+      <w:start w:val="1"/>
+      <w:numFmt w:val="bullet"/>
+      <w:lvlText w:val=""/>
+      <w:lvlJc w:val="left"/>
+      <w:pPr>
+        <w:tabs>
+          <w:tab w:val="num" w:pos="3600"/>
+        </w:tabs>
+        <w:ind w:left="3600" w:hanging="360"/>
+      </w:pPr>
+      <w:rPr>
+        <w:rFonts w:ascii="Wingdings" w:hAnsi="Wingdings" w:hint="default"/>
+        <w:sz w:val="20"/>
+      </w:rPr>
+    </w:lvl>
+    <w:lvl w:ilvl="5" w:tentative="1">
+      <w:start w:val="1"/>
+      <w:numFmt w:val="bullet"/>
+      <w:lvlText w:val=""/>
+      <w:lvlJc w:val="left"/>
+      <w:pPr>
+        <w:tabs>
+          <w:tab w:val="num" w:pos="4320"/>
+        </w:tabs>
+        <w:ind w:left="4320" w:hanging="360"/>
+      </w:pPr>
+      <w:rPr>
+        <w:rFonts w:ascii="Wingdings" w:hAnsi="Wingdings" w:hint="default"/>
+        <w:sz w:val="20"/>
+      </w:rPr>
+    </w:lvl>
+    <w:lvl w:ilvl="6" w:tentative="1">
+      <w:start w:val="1"/>
+      <w:numFmt w:val="bullet"/>
+      <w:lvlText w:val=""/>
+      <w:lvlJc w:val="left"/>
+      <w:pPr>
+        <w:tabs>
+          <w:tab w:val="num" w:pos="5040"/>
+        </w:tabs>
+        <w:ind w:left="5040" w:hanging="360"/>
+      </w:pPr>
+      <w:rPr>
+        <w:rFonts w:ascii="Wingdings" w:hAnsi="Wingdings" w:hint="default"/>
+        <w:sz w:val="20"/>
+      </w:rPr>
+    </w:lvl>
+    <w:lvl w:ilvl="7" w:tentative="1">
+      <w:start w:val="1"/>
+      <w:numFmt w:val="bullet"/>
+      <w:lvlText w:val=""/>
+      <w:lvlJc w:val="left"/>
+      <w:pPr>
+        <w:tabs>
+          <w:tab w:val="num" w:pos="5760"/>
+        </w:tabs>
+        <w:ind w:left="5760" w:hanging="360"/>
+      </w:pPr>
+      <w:rPr>
+        <w:rFonts w:ascii="Wingdings" w:hAnsi="Wingdings" w:hint="default"/>
+        <w:sz w:val="20"/>
+      </w:rPr>
+    </w:lvl>
+    <w:lvl w:ilvl="8" w:tentative="1">
+      <w:start w:val="1"/>
+      <w:numFmt w:val="bullet"/>
+      <w:lvlText w:val=""/>
+      <w:lvlJc w:val="left"/>
+      <w:pPr>
+        <w:tabs>
+          <w:tab w:val="num" w:pos="6480"/>
+        </w:tabs>
+        <w:ind w:left="6480" w:hanging="360"/>
+      </w:pPr>
+      <w:rPr>
+        <w:rFonts w:ascii="Wingdings" w:hAnsi="Wingdings" w:hint="default"/>
+        <w:sz w:val="20"/>
+      </w:rPr>
+    </w:lvl>
+  </w:abstractNum>
+  <w:abstractNum w:abstractNumId="10" w15:restartNumberingAfterBreak="0">
+    <w:nsid w:val="69355609"/>
+    <w:multiLevelType w:val="multilevel"/>
+    <w:tmpl w:val="BB7C2716"/>
+    <w:lvl w:ilvl="0">
+      <w:start w:val="1"/>
+      <w:numFmt w:val="bullet"/>
+      <w:lvlText w:val=""/>
+      <w:lvlJc w:val="left"/>
+      <w:pPr>
+        <w:tabs>
+          <w:tab w:val="num" w:pos="360"/>
+        </w:tabs>
+        <w:ind w:left="360" w:hanging="360"/>
+      </w:pPr>
+      <w:rPr>
+        <w:rFonts w:ascii="Symbol" w:hAnsi="Symbol" w:hint="default"/>
+        <w:sz w:val="20"/>
+      </w:rPr>
+    </w:lvl>
+    <w:lvl w:ilvl="1" w:tentative="1">
+      <w:start w:val="1"/>
+      <w:numFmt w:val="bullet"/>
+      <w:lvlText w:val="o"/>
+      <w:lvlJc w:val="left"/>
+      <w:pPr>
+        <w:tabs>
+          <w:tab w:val="num" w:pos="1080"/>
+        </w:tabs>
+        <w:ind w:left="1080" w:hanging="360"/>
+      </w:pPr>
+      <w:rPr>
+        <w:rFonts w:ascii="Courier New" w:hAnsi="Courier New" w:hint="default"/>
+        <w:sz w:val="20"/>
+      </w:rPr>
+    </w:lvl>
+    <w:lvl w:ilvl="2" w:tentative="1">
+      <w:start w:val="1"/>
+      <w:numFmt w:val="bullet"/>
+      <w:lvlText w:val=""/>
+      <w:lvlJc w:val="left"/>
+      <w:pPr>
+        <w:tabs>
+          <w:tab w:val="num" w:pos="1800"/>
+        </w:tabs>
+        <w:ind w:left="1800" w:hanging="360"/>
+      </w:pPr>
+      <w:rPr>
+        <w:rFonts w:ascii="Wingdings" w:hAnsi="Wingdings" w:hint="default"/>
+        <w:sz w:val="20"/>
+      </w:rPr>
+    </w:lvl>
+    <w:lvl w:ilvl="3" w:tentative="1">
+      <w:start w:val="1"/>
+      <w:numFmt w:val="bullet"/>
+      <w:lvlText w:val=""/>
+      <w:lvlJc w:val="left"/>
+      <w:pPr>
+        <w:tabs>
+          <w:tab w:val="num" w:pos="2520"/>
+        </w:tabs>
+        <w:ind w:left="2520" w:hanging="360"/>
+      </w:pPr>
+      <w:rPr>
+        <w:rFonts w:ascii="Wingdings" w:hAnsi="Wingdings" w:hint="default"/>
+        <w:sz w:val="20"/>
+      </w:rPr>
+    </w:lvl>
+    <w:lvl w:ilvl="4" w:tentative="1">
+      <w:start w:val="1"/>
+      <w:numFmt w:val="bullet"/>
+      <w:lvlText w:val=""/>
+      <w:lvlJc w:val="left"/>
+      <w:pPr>
+        <w:tabs>
+          <w:tab w:val="num" w:pos="3240"/>
+        </w:tabs>
+        <w:ind w:left="3240" w:hanging="360"/>
+      </w:pPr>
+      <w:rPr>
+        <w:rFonts w:ascii="Wingdings" w:hAnsi="Wingdings" w:hint="default"/>
+        <w:sz w:val="20"/>
+      </w:rPr>
+    </w:lvl>
+    <w:lvl w:ilvl="5" w:tentative="1">
+      <w:start w:val="1"/>
+      <w:numFmt w:val="bullet"/>
+      <w:lvlText w:val=""/>
+      <w:lvlJc w:val="left"/>
+      <w:pPr>
+        <w:tabs>
+          <w:tab w:val="num" w:pos="3960"/>
+        </w:tabs>
+        <w:ind w:left="3960" w:hanging="360"/>
+      </w:pPr>
+      <w:rPr>
+        <w:rFonts w:ascii="Wingdings" w:hAnsi="Wingdings" w:hint="default"/>
+        <w:sz w:val="20"/>
+      </w:rPr>
+    </w:lvl>
+    <w:lvl w:ilvl="6" w:tentative="1">
+      <w:start w:val="1"/>
+      <w:numFmt w:val="bullet"/>
+      <w:lvlText w:val=""/>
+      <w:lvlJc w:val="left"/>
+      <w:pPr>
+        <w:tabs>
+          <w:tab w:val="num" w:pos="4680"/>
+        </w:tabs>
+        <w:ind w:left="4680" w:hanging="360"/>
+      </w:pPr>
+      <w:rPr>
+        <w:rFonts w:ascii="Wingdings" w:hAnsi="Wingdings" w:hint="default"/>
+        <w:sz w:val="20"/>
+      </w:rPr>
+    </w:lvl>
+    <w:lvl w:ilvl="7" w:tentative="1">
+      <w:start w:val="1"/>
+      <w:numFmt w:val="bullet"/>
+      <w:lvlText w:val=""/>
+      <w:lvlJc w:val="left"/>
+      <w:pPr>
+        <w:tabs>
+          <w:tab w:val="num" w:pos="5400"/>
+        </w:tabs>
+        <w:ind w:left="5400" w:hanging="360"/>
+      </w:pPr>
+      <w:rPr>
+        <w:rFonts w:ascii="Wingdings" w:hAnsi="Wingdings" w:hint="default"/>
+        <w:sz w:val="20"/>
+      </w:rPr>
+    </w:lvl>
+    <w:lvl w:ilvl="8" w:tentative="1">
+      <w:start w:val="1"/>
+      <w:numFmt w:val="bullet"/>
+      <w:lvlText w:val=""/>
+      <w:lvlJc w:val="left"/>
+      <w:pPr>
+        <w:tabs>
+          <w:tab w:val="num" w:pos="6120"/>
+        </w:tabs>
+        <w:ind w:left="6120" w:hanging="360"/>
+      </w:pPr>
+      <w:rPr>
+        <w:rFonts w:ascii="Wingdings" w:hAnsi="Wingdings" w:hint="default"/>
+        <w:sz w:val="20"/>
+      </w:rPr>
+    </w:lvl>
+  </w:abstractNum>
   <w:num w:numId="1" w16cid:durableId="1467702274">
     <w:abstractNumId w:val="8"/>
   </w:num>
@@ -2159,6 +2547,12 @@
   </w:num>
   <w:num w:numId="9" w16cid:durableId="1063681259">
     <w:abstractNumId w:val="0"/>
+  </w:num>
+  <w:num w:numId="10" w16cid:durableId="1720788259">
+    <w:abstractNumId w:val="9"/>
+  </w:num>
+  <w:num w:numId="11" w16cid:durableId="1933510995">
+    <w:abstractNumId w:val="10"/>
   </w:num>
 </w:numbering>
 </file>
@@ -13568,6 +13962,19 @@
       <w:shd w:val="clear" w:color="auto" w:fill="E1DFDD"/>
     </w:rPr>
   </w:style>
+  <w:style w:type="paragraph" w:styleId="NormalWeb">
+    <w:name w:val="Normal (Web)"/>
+    <w:basedOn w:val="Normal"/>
+    <w:uiPriority w:val="99"/>
+    <w:semiHidden/>
+    <w:unhideWhenUsed/>
+    <w:rsid w:val="009D2155"/>
+    <w:rPr>
+      <w:rFonts w:ascii="Times New Roman" w:hAnsi="Times New Roman" w:cs="Times New Roman"/>
+      <w:sz w:val="24"/>
+      <w:szCs w:val="24"/>
+    </w:rPr>
+  </w:style>
 </w:styles>
 </file>
 

</xml_diff>

<commit_message>
update resume add professional summary and clean
</commit_message>
<xml_diff>
--- a/v2/src/assets/resume/Mark_Valles_Resume.docx
+++ b/v2/src/assets/resume/Mark_Valles_Resume.docx
@@ -268,19 +268,7 @@
         <w:rPr>
           <w:sz w:val="19"/>
         </w:rPr>
-        <w:t>Architecting, deploying, and maintaining foundational digital banking solutions for</w:t>
-      </w:r>
-      <w:r>
-        <w:rPr>
-          <w:sz w:val="19"/>
-        </w:rPr>
-        <w:t xml:space="preserve"> </w:t>
-      </w:r>
-      <w:r>
-        <w:rPr>
-          <w:sz w:val="19"/>
-        </w:rPr>
-        <w:t>Security Bank Corporation. Collaborating closely across both responsive frontend interfaces and high-performance backend production architectures to ensure seamless high-availability banking services and optimized consumer user experiences.</w:t>
+        <w:t>Develop and maintain digital banking applications for Security Bank. Build frontend and backend features, troubleshoot production issues, and ensure system reliability.</w:t>
       </w:r>
     </w:p>
     <w:tbl>
@@ -365,7 +353,7 @@
         <w:rPr>
           <w:sz w:val="19"/>
         </w:rPr>
-        <w:t>Analyzed and implemented complex technical requirements and critical architectural updates for high-throughput backend services deployed in the highly regulated PAGCOR POGO industry environment. Successfully engineered, scalable file management mechanisms and robust multi-factor/OTP authentication systems.</w:t>
+        <w:t>Developed and maintained backend services for a PAGCOR-regulated platform. Implemented new features, system enhancements, file management, and OTP authentication.</w:t>
       </w:r>
     </w:p>
     <w:tbl>
@@ -887,6 +875,12 @@
         <w:jc w:val="both"/>
       </w:pPr>
     </w:p>
+    <w:p>
+      <w:pPr>
+        <w:spacing w:after="120"/>
+        <w:jc w:val="both"/>
+      </w:pPr>
+    </w:p>
     <w:tbl>
       <w:tblPr>
         <w:tblW w:w="0" w:type="auto"/>
@@ -975,12 +969,6 @@
         </w:rPr>
         <w:t>Warehouse Automated Inventory System (WAIS): Designed and built a secure, centralized logistics inventory application using PHP, Bootstrap, and JavaScript to manage high-security camp logistics data, tracking critical hardware, fleets, and tactical gear.</w:t>
       </w:r>
-    </w:p>
-    <w:p>
-      <w:pPr>
-        <w:spacing w:after="120"/>
-        <w:jc w:val="both"/>
-      </w:pPr>
     </w:p>
     <w:tbl>
       <w:tblPr>
@@ -1562,7 +1550,43 @@
               <w:rPr>
                 <w:sz w:val="19"/>
               </w:rPr>
-              <w:t>PHP (Laravel, CodeIgniter, Yii2), TypeScript, JavaScript (Node.js, Express.js), Python (FastAPI), Java (SpringBoot)</w:t>
+              <w:t>PHP (Laravel</w:t>
+            </w:r>
+            <w:r>
+              <w:rPr>
+                <w:sz w:val="19"/>
+              </w:rPr>
+              <w:t>/</w:t>
+            </w:r>
+            <w:r>
+              <w:rPr>
+                <w:sz w:val="19"/>
+              </w:rPr>
+              <w:t>CodeIgniter</w:t>
+            </w:r>
+            <w:r>
+              <w:rPr>
+                <w:sz w:val="19"/>
+              </w:rPr>
+              <w:t>/</w:t>
+            </w:r>
+            <w:r>
+              <w:rPr>
+                <w:sz w:val="19"/>
+              </w:rPr>
+              <w:t>Yii2), TypeScript, JavaScript (</w:t>
+            </w:r>
+            <w:r>
+              <w:rPr>
+                <w:sz w:val="19"/>
+              </w:rPr>
+              <w:t>NextJs/Node.js/</w:t>
+            </w:r>
+            <w:r>
+              <w:rPr>
+                <w:sz w:val="19"/>
+              </w:rPr>
+              <w:t>Express.js), Python (FastAPI), Java (SpringBoot)</w:t>
             </w:r>
           </w:p>
         </w:tc>

</xml_diff>

<commit_message>
update resume add professional summary and clean desc
</commit_message>
<xml_diff>
--- a/v2/src/assets/resume/Mark_Valles_Resume.docx
+++ b/v2/src/assets/resume/Mark_Valles_Resume.docx
@@ -21,13 +21,23 @@
         <w:spacing w:after="120"/>
         <w:jc w:val="center"/>
       </w:pPr>
+      <w:proofErr w:type="spellStart"/>
       <w:r>
         <w:rPr>
           <w:b/>
           <w:color w:val="475569"/>
           <w:sz w:val="22"/>
         </w:rPr>
-        <w:t xml:space="preserve">Fullstack Engineer &amp; </w:t>
+        <w:t>Fullstack</w:t>
+      </w:r>
+      <w:proofErr w:type="spellEnd"/>
+      <w:r>
+        <w:rPr>
+          <w:b/>
+          <w:color w:val="475569"/>
+          <w:sz w:val="22"/>
+        </w:rPr>
+        <w:t xml:space="preserve"> Engineer &amp; </w:t>
       </w:r>
       <w:r>
         <w:rPr>
@@ -48,7 +58,39 @@
           <w:color w:val="475569"/>
           <w:sz w:val="17"/>
         </w:rPr>
-        <w:t>138 Mahogany Street, Creekland Hagonoy, Taguig City, Philippines | +639564433716 | vallesmark15@gmail.com</w:t>
+        <w:t xml:space="preserve">138 Mahogany Street, </w:t>
+      </w:r>
+      <w:proofErr w:type="spellStart"/>
+      <w:r>
+        <w:rPr>
+          <w:color w:val="475569"/>
+          <w:sz w:val="17"/>
+        </w:rPr>
+        <w:t>Creekland</w:t>
+      </w:r>
+      <w:proofErr w:type="spellEnd"/>
+      <w:r>
+        <w:rPr>
+          <w:color w:val="475569"/>
+          <w:sz w:val="17"/>
+        </w:rPr>
+        <w:t xml:space="preserve"> </w:t>
+      </w:r>
+      <w:proofErr w:type="spellStart"/>
+      <w:r>
+        <w:rPr>
+          <w:color w:val="475569"/>
+          <w:sz w:val="17"/>
+        </w:rPr>
+        <w:t>Hagonoy</w:t>
+      </w:r>
+      <w:proofErr w:type="spellEnd"/>
+      <w:r>
+        <w:rPr>
+          <w:color w:val="475569"/>
+          <w:sz w:val="17"/>
+        </w:rPr>
+        <w:t>, Taguig City, Philippines | +639564433716 | vallesmark15@gmail.com</w:t>
       </w:r>
       <w:r>
         <w:rPr>
@@ -132,6 +174,7 @@
       <w:r>
         <w:br/>
       </w:r>
+      <w:proofErr w:type="spellStart"/>
       <w:r>
         <w:rPr>
           <w:b/>
@@ -139,7 +182,17 @@
           <w:sz w:val="19"/>
           <w:lang w:val="en-PH"/>
         </w:rPr>
-        <w:t>Fullstack Engineer</w:t>
+        <w:t>Fullstack</w:t>
+      </w:r>
+      <w:proofErr w:type="spellEnd"/>
+      <w:r>
+        <w:rPr>
+          <w:b/>
+          <w:bCs/>
+          <w:sz w:val="19"/>
+          <w:lang w:val="en-PH"/>
+        </w:rPr>
+        <w:t xml:space="preserve"> Engineer</w:t>
       </w:r>
       <w:r>
         <w:rPr>
@@ -201,20 +254,46 @@
             <w:pPr>
               <w:spacing w:before="80" w:after="40"/>
             </w:pPr>
+            <w:proofErr w:type="spellStart"/>
             <w:r>
               <w:rPr>
                 <w:b/>
                 <w:color w:val="1E293B"/>
                 <w:sz w:val="21"/>
               </w:rPr>
-              <w:t>Fullstack Engineer</w:t>
+              <w:t>Fullstack</w:t>
+            </w:r>
+            <w:proofErr w:type="spellEnd"/>
+            <w:r>
+              <w:rPr>
+                <w:b/>
+                <w:color w:val="1E293B"/>
+                <w:sz w:val="21"/>
+              </w:rPr>
+              <w:t xml:space="preserve"> Engineer</w:t>
             </w:r>
             <w:r>
               <w:rPr>
                 <w:color w:val="64748B"/>
                 <w:sz w:val="19"/>
               </w:rPr>
-              <w:t xml:space="preserve"> | Ascendion Digital Solutions </w:t>
+              <w:t xml:space="preserve"> | </w:t>
+            </w:r>
+            <w:proofErr w:type="spellStart"/>
+            <w:r>
+              <w:rPr>
+                <w:color w:val="64748B"/>
+                <w:sz w:val="19"/>
+              </w:rPr>
+              <w:t>Ascendion</w:t>
+            </w:r>
+            <w:proofErr w:type="spellEnd"/>
+            <w:r>
+              <w:rPr>
+                <w:color w:val="64748B"/>
+                <w:sz w:val="19"/>
+              </w:rPr>
+              <w:t xml:space="preserve"> Digital Solutions </w:t>
             </w:r>
             <w:r>
               <w:rPr>
@@ -268,7 +347,19 @@
         <w:rPr>
           <w:sz w:val="19"/>
         </w:rPr>
-        <w:t>Develop and maintain digital banking applications for Security Bank. Build frontend and backend features, troubleshoot production issues, and ensure system reliability.</w:t>
+        <w:t xml:space="preserve">Develop and maintain digital </w:t>
+      </w:r>
+      <w:r>
+        <w:rPr>
+          <w:sz w:val="19"/>
+        </w:rPr>
+        <w:t>business loan</w:t>
+      </w:r>
+      <w:r>
+        <w:rPr>
+          <w:sz w:val="19"/>
+        </w:rPr>
+        <w:t xml:space="preserve"> applications for Security Bank. Build frontend and backend features, troubleshoot production issues, and ensure system reliability.</w:t>
       </w:r>
     </w:p>
     <w:tbl>
@@ -313,7 +404,23 @@
                 <w:color w:val="64748B"/>
                 <w:sz w:val="19"/>
               </w:rPr>
-              <w:t xml:space="preserve"> | Dynamic Strategy Solutions (Client: Longsage)</w:t>
+              <w:t xml:space="preserve"> | Dynamic Strategy Solutions (Client: </w:t>
+            </w:r>
+            <w:proofErr w:type="spellStart"/>
+            <w:r>
+              <w:rPr>
+                <w:color w:val="64748B"/>
+                <w:sz w:val="19"/>
+              </w:rPr>
+              <w:t>Longsage</w:t>
+            </w:r>
+            <w:proofErr w:type="spellEnd"/>
+            <w:r>
+              <w:rPr>
+                <w:color w:val="64748B"/>
+                <w:sz w:val="19"/>
+              </w:rPr>
+              <w:t>)</w:t>
             </w:r>
           </w:p>
         </w:tc>
@@ -778,7 +885,21 @@
         <w:rPr>
           <w:sz w:val="19"/>
         </w:rPr>
-        <w:t>Translated high-fidelity, pixel-perfect PSD layouts into performant, responsive frontend web components using Vue.js and the Vuetify material design framework.</w:t>
+        <w:t xml:space="preserve">Translated high-fidelity, pixel-perfect PSD layouts into performant, responsive frontend web components using Vue.js and the </w:t>
+      </w:r>
+      <w:proofErr w:type="spellStart"/>
+      <w:r>
+        <w:rPr>
+          <w:sz w:val="19"/>
+        </w:rPr>
+        <w:t>Vuetify</w:t>
+      </w:r>
+      <w:proofErr w:type="spellEnd"/>
+      <w:r>
+        <w:rPr>
+          <w:sz w:val="19"/>
+        </w:rPr>
+        <w:t xml:space="preserve"> material design framework.</w:t>
       </w:r>
     </w:p>
     <w:tbl>
@@ -823,8 +944,17 @@
                 <w:color w:val="64748B"/>
                 <w:sz w:val="19"/>
               </w:rPr>
-              <w:t xml:space="preserve"> | TaskUs</w:t>
+              <w:t xml:space="preserve"> | </w:t>
             </w:r>
+            <w:proofErr w:type="spellStart"/>
+            <w:r>
+              <w:rPr>
+                <w:color w:val="64748B"/>
+                <w:sz w:val="19"/>
+              </w:rPr>
+              <w:t>TaskUs</w:t>
+            </w:r>
+            <w:proofErr w:type="spellEnd"/>
           </w:p>
         </w:tc>
         <w:tc>
@@ -1576,17 +1706,53 @@
               </w:rPr>
               <w:t>Yii2), TypeScript, JavaScript (</w:t>
             </w:r>
+            <w:proofErr w:type="spellStart"/>
             <w:r>
               <w:rPr>
                 <w:sz w:val="19"/>
               </w:rPr>
-              <w:t>NextJs/Node.js/</w:t>
+              <w:t>NextJs</w:t>
+            </w:r>
+            <w:proofErr w:type="spellEnd"/>
+            <w:r>
+              <w:rPr>
+                <w:sz w:val="19"/>
+              </w:rPr>
+              <w:t>/Node.js/</w:t>
             </w:r>
             <w:r>
               <w:rPr>
                 <w:sz w:val="19"/>
               </w:rPr>
-              <w:t>Express.js), Python (FastAPI), Java (SpringBoot)</w:t>
+              <w:t>Express.js), Python (</w:t>
+            </w:r>
+            <w:proofErr w:type="spellStart"/>
+            <w:r>
+              <w:rPr>
+                <w:sz w:val="19"/>
+              </w:rPr>
+              <w:t>FastAPI</w:t>
+            </w:r>
+            <w:proofErr w:type="spellEnd"/>
+            <w:r>
+              <w:rPr>
+                <w:sz w:val="19"/>
+              </w:rPr>
+              <w:t>), Java (</w:t>
+            </w:r>
+            <w:proofErr w:type="spellStart"/>
+            <w:r>
+              <w:rPr>
+                <w:sz w:val="19"/>
+              </w:rPr>
+              <w:t>SpringBoot</w:t>
+            </w:r>
+            <w:proofErr w:type="spellEnd"/>
+            <w:r>
+              <w:rPr>
+                <w:sz w:val="19"/>
+              </w:rPr>
+              <w:t>)</w:t>
             </w:r>
           </w:p>
         </w:tc>
@@ -1706,8 +1872,16 @@
               <w:rPr>
                 <w:sz w:val="19"/>
               </w:rPr>
-              <w:t>MySQL, PostgreSQL, SQL Server, MongoDB, Redis, Valkey</w:t>
+              <w:t xml:space="preserve">MySQL, PostgreSQL, SQL Server, MongoDB, Redis, </w:t>
             </w:r>
+            <w:proofErr w:type="spellStart"/>
+            <w:r>
+              <w:rPr>
+                <w:sz w:val="19"/>
+              </w:rPr>
+              <w:t>Valkey</w:t>
+            </w:r>
+            <w:proofErr w:type="spellEnd"/>
           </w:p>
         </w:tc>
       </w:tr>
@@ -1763,7 +1937,35 @@
               <w:rPr>
                 <w:sz w:val="19"/>
               </w:rPr>
-              <w:t>Claude, Gemini, GPT API, LM Studio, ElevenLabs, Twilio, ProcessMaker, Zapier, Make, Monday.com</w:t>
+              <w:t xml:space="preserve">Claude, Gemini, GPT API, LM Studio, </w:t>
+            </w:r>
+            <w:proofErr w:type="spellStart"/>
+            <w:r>
+              <w:rPr>
+                <w:sz w:val="19"/>
+              </w:rPr>
+              <w:t>ElevenLabs</w:t>
+            </w:r>
+            <w:proofErr w:type="spellEnd"/>
+            <w:r>
+              <w:rPr>
+                <w:sz w:val="19"/>
+              </w:rPr>
+              <w:t xml:space="preserve">, Twilio, </w:t>
+            </w:r>
+            <w:proofErr w:type="spellStart"/>
+            <w:r>
+              <w:rPr>
+                <w:sz w:val="19"/>
+              </w:rPr>
+              <w:t>ProcessMaker</w:t>
+            </w:r>
+            <w:proofErr w:type="spellEnd"/>
+            <w:r>
+              <w:rPr>
+                <w:sz w:val="19"/>
+              </w:rPr>
+              <w:t>, Zapier, Make, Monday.com</w:t>
             </w:r>
           </w:p>
         </w:tc>
@@ -1820,8 +2022,16 @@
               <w:rPr>
                 <w:sz w:val="19"/>
               </w:rPr>
-              <w:t>Docker, Apache, Nginx, Render, Supabase</w:t>
+              <w:t xml:space="preserve">Docker, Apache, Nginx, Render, </w:t>
             </w:r>
+            <w:proofErr w:type="spellStart"/>
+            <w:r>
+              <w:rPr>
+                <w:sz w:val="19"/>
+              </w:rPr>
+              <w:t>Supabase</w:t>
+            </w:r>
+            <w:proofErr w:type="spellEnd"/>
           </w:p>
         </w:tc>
       </w:tr>

</xml_diff>